<commit_message>
HW1: add report PDF
</commit_message>
<xml_diff>
--- a/reports/hw01/report.docx
+++ b/reports/hw01/report.docx
@@ -51,39 +51,22 @@
       <w:pPr>
         <w:pStyle w:val="NormalWeb"/>
         <w:spacing w:before="0" w:beforeAutospacing="0" w:after="0" w:afterAutospacing="0" w:line="480" w:lineRule="auto"/>
+        <w:rPr>
+          <w:rFonts w:hint="eastAsia"/>
+        </w:rPr>
       </w:pPr>
       <w:r>
         <w:rPr>
           <w:color w:val="1F1F1F"/>
           <w:shd w:val="clear" w:color="auto" w:fill="FFFFFF"/>
         </w:rPr>
-        <w:t>31</w:t>
-      </w:r>
-      <w:r>
-        <w:rPr>
-          <w:color w:val="1F1F1F"/>
-          <w:shd w:val="clear" w:color="auto" w:fill="FFFFFF"/>
-        </w:rPr>
-        <w:t xml:space="preserve"> </w:t>
-      </w:r>
-      <w:r>
-        <w:rPr>
-          <w:color w:val="1F1F1F"/>
-          <w:shd w:val="clear" w:color="auto" w:fill="FFFFFF"/>
-        </w:rPr>
-        <w:t>August</w:t>
-      </w:r>
-      <w:r>
-        <w:rPr>
-          <w:color w:val="1F1F1F"/>
-          <w:shd w:val="clear" w:color="auto" w:fill="FFFFFF"/>
-        </w:rPr>
-        <w:t xml:space="preserve"> 2026</w:t>
+        <w:t>31 August 2026</w:t>
       </w:r>
     </w:p>
     <w:p>
       <w:pPr>
         <w:spacing w:after="80"/>
+        <w:jc w:val="center"/>
         <w:rPr>
           <w:b/>
           <w:bCs/>
@@ -91,12 +74,6 @@
           <w:szCs w:val="36"/>
         </w:rPr>
       </w:pPr>
-    </w:p>
-    <w:p>
-      <w:pPr>
-        <w:spacing w:after="80"/>
-        <w:jc w:val="center"/>
-      </w:pPr>
       <w:r>
         <w:rPr>
           <w:b/>
@@ -105,6 +82,20 @@
           <w:szCs w:val="36"/>
         </w:rPr>
         <w:t>DATA 260 — Homework 1</w:t>
+      </w:r>
+    </w:p>
+    <w:p>
+      <w:pPr>
+        <w:spacing w:after="320"/>
+        <w:jc w:val="center"/>
+      </w:pPr>
+      <w:r>
+        <w:rPr>
+          <w:color w:val="1155CC"/>
+          <w:sz w:val="20"/>
+          <w:szCs w:val="20"/>
+        </w:rPr>
+        <w:t>Repository: https://github.com/xuwang-goldenwater/data260-9275</w:t>
       </w:r>
     </w:p>
     <w:p>
@@ -146,12 +137,6 @@
         <w:gridCol w:w="6360"/>
       </w:tblGrid>
       <w:tr>
-        <w:tblPrEx>
-          <w:tblCellMar>
-            <w:top w:w="0" w:type="dxa"/>
-            <w:bottom w:w="0" w:type="dxa"/>
-          </w:tblCellMar>
-        </w:tblPrEx>
         <w:tc>
           <w:tcPr>
             <w:tcW w:w="3000" w:type="dxa"/>
@@ -197,12 +182,6 @@
         </w:tc>
       </w:tr>
       <w:tr>
-        <w:tblPrEx>
-          <w:tblCellMar>
-            <w:top w:w="0" w:type="dxa"/>
-            <w:bottom w:w="0" w:type="dxa"/>
-          </w:tblCellMar>
-        </w:tblPrEx>
         <w:tc>
           <w:tcPr>
             <w:tcW w:w="3000" w:type="dxa"/>
@@ -264,12 +243,6 @@
         </w:tc>
       </w:tr>
       <w:tr>
-        <w:tblPrEx>
-          <w:tblCellMar>
-            <w:top w:w="0" w:type="dxa"/>
-            <w:bottom w:w="0" w:type="dxa"/>
-          </w:tblCellMar>
-        </w:tblPrEx>
         <w:tc>
           <w:tcPr>
             <w:tcW w:w="3000" w:type="dxa"/>
@@ -315,12 +288,6 @@
         </w:tc>
       </w:tr>
       <w:tr>
-        <w:tblPrEx>
-          <w:tblCellMar>
-            <w:top w:w="0" w:type="dxa"/>
-            <w:bottom w:w="0" w:type="dxa"/>
-          </w:tblCellMar>
-        </w:tblPrEx>
         <w:tc>
           <w:tcPr>
             <w:tcW w:w="3000" w:type="dxa"/>
@@ -366,12 +333,6 @@
         </w:tc>
       </w:tr>
       <w:tr>
-        <w:tblPrEx>
-          <w:tblCellMar>
-            <w:top w:w="0" w:type="dxa"/>
-            <w:bottom w:w="0" w:type="dxa"/>
-          </w:tblCellMar>
-        </w:tblPrEx>
         <w:tc>
           <w:tcPr>
             <w:tcW w:w="3000" w:type="dxa"/>
@@ -433,12 +394,6 @@
         </w:tc>
       </w:tr>
       <w:tr>
-        <w:tblPrEx>
-          <w:tblCellMar>
-            <w:top w:w="0" w:type="dxa"/>
-            <w:bottom w:w="0" w:type="dxa"/>
-          </w:tblCellMar>
-        </w:tblPrEx>
         <w:tc>
           <w:tcPr>
             <w:tcW w:w="3000" w:type="dxa"/>
@@ -535,12 +490,6 @@
         <w:gridCol w:w="6760"/>
       </w:tblGrid>
       <w:tr>
-        <w:tblPrEx>
-          <w:tblCellMar>
-            <w:top w:w="0" w:type="dxa"/>
-            <w:bottom w:w="0" w:type="dxa"/>
-          </w:tblCellMar>
-        </w:tblPrEx>
         <w:tc>
           <w:tcPr>
             <w:tcW w:w="2600" w:type="dxa"/>
@@ -586,12 +535,6 @@
         </w:tc>
       </w:tr>
       <w:tr>
-        <w:tblPrEx>
-          <w:tblCellMar>
-            <w:top w:w="0" w:type="dxa"/>
-            <w:bottom w:w="0" w:type="dxa"/>
-          </w:tblCellMar>
-        </w:tblPrEx>
         <w:tc>
           <w:tcPr>
             <w:tcW w:w="2600" w:type="dxa"/>
@@ -653,12 +596,6 @@
         </w:tc>
       </w:tr>
       <w:tr>
-        <w:tblPrEx>
-          <w:tblCellMar>
-            <w:top w:w="0" w:type="dxa"/>
-            <w:bottom w:w="0" w:type="dxa"/>
-          </w:tblCellMar>
-        </w:tblPrEx>
         <w:tc>
           <w:tcPr>
             <w:tcW w:w="2600" w:type="dxa"/>
@@ -720,12 +657,6 @@
         </w:tc>
       </w:tr>
       <w:tr>
-        <w:tblPrEx>
-          <w:tblCellMar>
-            <w:top w:w="0" w:type="dxa"/>
-            <w:bottom w:w="0" w:type="dxa"/>
-          </w:tblCellMar>
-        </w:tblPrEx>
         <w:tc>
           <w:tcPr>
             <w:tcW w:w="2600" w:type="dxa"/>
@@ -787,12 +718,6 @@
         </w:tc>
       </w:tr>
       <w:tr>
-        <w:tblPrEx>
-          <w:tblCellMar>
-            <w:top w:w="0" w:type="dxa"/>
-            <w:bottom w:w="0" w:type="dxa"/>
-          </w:tblCellMar>
-        </w:tblPrEx>
         <w:tc>
           <w:tcPr>
             <w:tcW w:w="2600" w:type="dxa"/>
@@ -857,18 +782,22 @@
     <w:p/>
     <w:p>
       <w:pPr>
-        <w:spacing w:after="320"/>
+        <w:rPr>
+          <w:rFonts w:ascii="Times New Roman" w:eastAsia="Times New Roman" w:hAnsi="Times New Roman" w:cs="Times New Roman"/>
+          <w:sz w:val="24"/>
+          <w:szCs w:val="24"/>
+        </w:rPr>
       </w:pPr>
       <w:r>
         <w:t xml:space="preserve">Tagged commit hash (tag hw1): </w:t>
       </w:r>
       <w:r>
         <w:rPr>
-          <w:color w:val="1155CC"/>
-          <w:sz w:val="20"/>
-          <w:szCs w:val="20"/>
-        </w:rPr>
-        <w:t>Repository: https://github.com/xuwang-goldenwater/data260-9275</w:t>
+          <w:rFonts w:ascii="Times New Roman" w:eastAsia="Times New Roman" w:hAnsi="Times New Roman" w:cs="Times New Roman"/>
+          <w:sz w:val="24"/>
+          <w:szCs w:val="24"/>
+        </w:rPr>
+        <w:t>ca3b733</w:t>
       </w:r>
     </w:p>
     <w:p>
@@ -985,12 +914,6 @@
         <w:gridCol w:w="9360"/>
       </w:tblGrid>
       <w:tr>
-        <w:tblPrEx>
-          <w:tblCellMar>
-            <w:top w:w="0" w:type="dxa"/>
-            <w:bottom w:w="0" w:type="dxa"/>
-          </w:tblCellMar>
-        </w:tblPrEx>
         <w:trPr>
           <w:cantSplit/>
         </w:trPr>
@@ -1154,12 +1077,6 @@
         <w:gridCol w:w="9360"/>
       </w:tblGrid>
       <w:tr>
-        <w:tblPrEx>
-          <w:tblCellMar>
-            <w:top w:w="0" w:type="dxa"/>
-            <w:bottom w:w="0" w:type="dxa"/>
-          </w:tblCellMar>
-        </w:tblPrEx>
         <w:trPr>
           <w:cantSplit/>
         </w:trPr>
@@ -1217,10 +1134,6 @@
     <w:p>
       <w:pPr>
         <w:spacing w:after="120"/>
-        <w:rPr>
-          <w:b/>
-          <w:bCs/>
-        </w:rPr>
       </w:pPr>
       <w:r>
         <w:rPr>
@@ -1275,21 +1188,21 @@
     <w:p>
       <w:pPr>
         <w:spacing w:after="120"/>
-      </w:pPr>
-    </w:p>
-    <w:p>
-      <w:pPr>
-        <w:spacing w:after="120"/>
-      </w:pPr>
-      <w:r>
-        <w:rPr>
+        <w:rPr>
+          <w:b/>
+          <w:bCs/>
+        </w:rPr>
+      </w:pPr>
+      <w:r>
+        <w:rPr>
+          <w:rFonts w:hint="eastAsia"/>
           <w:noProof/>
         </w:rPr>
         <w:drawing>
-          <wp:inline distT="0" distB="0" distL="0" distR="0" wp14:anchorId="7960AE42" wp14:editId="0D0A03EE">
-            <wp:extent cx="5673618" cy="3144130"/>
-            <wp:effectExtent l="0" t="0" r="3810" b="5715"/>
-            <wp:docPr id="2" name="Picture 2"/>
+          <wp:inline distT="0" distB="0" distL="0" distR="0" wp14:anchorId="078B5AD3" wp14:editId="08280016">
+            <wp:extent cx="2660754" cy="3347831"/>
+            <wp:effectExtent l="0" t="0" r="6350" b="5080"/>
+            <wp:docPr id="1" name="Picture 1"/>
             <wp:cNvGraphicFramePr>
               <a:graphicFrameLocks xmlns:a="http://schemas.openxmlformats.org/drawingml/2006/main" noChangeAspect="1"/>
             </wp:cNvGraphicFramePr>
@@ -1297,7 +1210,7 @@
               <a:graphicData uri="http://schemas.openxmlformats.org/drawingml/2006/picture">
                 <pic:pic xmlns:pic="http://schemas.openxmlformats.org/drawingml/2006/picture">
                   <pic:nvPicPr>
-                    <pic:cNvPr id="2" name="Screenshot 2026-08-31 at 10.30.08.png"/>
+                    <pic:cNvPr id="1" name="Screenshot 2026-08-31 at 12.47.28.png"/>
                     <pic:cNvPicPr/>
                   </pic:nvPicPr>
                   <pic:blipFill>
@@ -1315,7 +1228,7 @@
                   <pic:spPr>
                     <a:xfrm>
                       <a:off x="0" y="0"/>
-                      <a:ext cx="5678834" cy="3147021"/>
+                      <a:ext cx="2667618" cy="3356468"/>
                     </a:xfrm>
                     <a:prstGeom prst="rect">
                       <a:avLst/>
@@ -1330,6 +1243,18 @@
     </w:p>
     <w:p>
       <w:pPr>
+        <w:spacing w:after="120"/>
+      </w:pPr>
+    </w:p>
+    <w:p>
+      <w:pPr>
+        <w:spacing w:after="120"/>
+      </w:pPr>
+      <w:bookmarkStart w:id="0" w:name="_GoBack"/>
+      <w:bookmarkEnd w:id="0"/>
+    </w:p>
+    <w:p>
+      <w:pPr>
         <w:pStyle w:val="Heading2"/>
       </w:pPr>
     </w:p>
@@ -1338,7 +1263,6 @@
         <w:pStyle w:val="Heading2"/>
       </w:pPr>
       <w:r>
-        <w:lastRenderedPageBreak/>
         <w:t>I.3 — DOMAIN_SCHEMA.md defining the entity fields and category values</w:t>
       </w:r>
     </w:p>
@@ -1385,12 +1309,6 @@
         <w:gridCol w:w="7160"/>
       </w:tblGrid>
       <w:tr>
-        <w:tblPrEx>
-          <w:tblCellMar>
-            <w:top w:w="0" w:type="dxa"/>
-            <w:bottom w:w="0" w:type="dxa"/>
-          </w:tblCellMar>
-        </w:tblPrEx>
         <w:tc>
           <w:tcPr>
             <w:tcW w:w="2200" w:type="dxa"/>
@@ -1447,12 +1365,6 @@
         </w:tc>
       </w:tr>
       <w:tr>
-        <w:tblPrEx>
-          <w:tblCellMar>
-            <w:top w:w="0" w:type="dxa"/>
-            <w:bottom w:w="0" w:type="dxa"/>
-          </w:tblCellMar>
-        </w:tblPrEx>
         <w:tc>
           <w:tcPr>
             <w:tcW w:w="2200" w:type="dxa"/>
@@ -1509,12 +1421,6 @@
         </w:tc>
       </w:tr>
       <w:tr>
-        <w:tblPrEx>
-          <w:tblCellMar>
-            <w:top w:w="0" w:type="dxa"/>
-            <w:bottom w:w="0" w:type="dxa"/>
-          </w:tblCellMar>
-        </w:tblPrEx>
         <w:tc>
           <w:tcPr>
             <w:tcW w:w="2200" w:type="dxa"/>
@@ -1571,12 +1477,6 @@
         </w:tc>
       </w:tr>
       <w:tr>
-        <w:tblPrEx>
-          <w:tblCellMar>
-            <w:top w:w="0" w:type="dxa"/>
-            <w:bottom w:w="0" w:type="dxa"/>
-          </w:tblCellMar>
-        </w:tblPrEx>
         <w:tc>
           <w:tcPr>
             <w:tcW w:w="2200" w:type="dxa"/>
@@ -1631,12 +1531,6 @@
         </w:tc>
       </w:tr>
       <w:tr>
-        <w:tblPrEx>
-          <w:tblCellMar>
-            <w:top w:w="0" w:type="dxa"/>
-            <w:bottom w:w="0" w:type="dxa"/>
-          </w:tblCellMar>
-        </w:tblPrEx>
         <w:tc>
           <w:tcPr>
             <w:tcW w:w="2200" w:type="dxa"/>
@@ -1691,12 +1585,6 @@
         </w:tc>
       </w:tr>
       <w:tr>
-        <w:tblPrEx>
-          <w:tblCellMar>
-            <w:top w:w="0" w:type="dxa"/>
-            <w:bottom w:w="0" w:type="dxa"/>
-          </w:tblCellMar>
-        </w:tblPrEx>
         <w:tc>
           <w:tcPr>
             <w:tcW w:w="2200" w:type="dxa"/>
@@ -1753,12 +1641,6 @@
         </w:tc>
       </w:tr>
       <w:tr>
-        <w:tblPrEx>
-          <w:tblCellMar>
-            <w:top w:w="0" w:type="dxa"/>
-            <w:bottom w:w="0" w:type="dxa"/>
-          </w:tblCellMar>
-        </w:tblPrEx>
         <w:tc>
           <w:tcPr>
             <w:tcW w:w="2200" w:type="dxa"/>
@@ -1883,13 +1765,7 @@
         <w:t>details</w:t>
       </w:r>
       <w:r>
-        <w:t xml:space="preserve">, please go to the </w:t>
-      </w:r>
-      <w:r>
-        <w:t xml:space="preserve">DOMAIN_SCHEMA.md </w:t>
-      </w:r>
-      <w:r>
-        <w:t>file.</w:t>
+        <w:t>, please go to the DOMAIN_SCHEMA.md file.</w:t>
       </w:r>
       <w:r>
         <w:br w:type="page"/>
@@ -1946,12 +1822,6 @@
         <w:gridCol w:w="9360"/>
       </w:tblGrid>
       <w:tr>
-        <w:tblPrEx>
-          <w:tblCellMar>
-            <w:top w:w="0" w:type="dxa"/>
-            <w:bottom w:w="0" w:type="dxa"/>
-          </w:tblCellMar>
-        </w:tblPrEx>
         <w:trPr>
           <w:cantSplit/>
         </w:trPr>
@@ -2136,12 +2006,6 @@
         <w:gridCol w:w="9360"/>
       </w:tblGrid>
       <w:tr>
-        <w:tblPrEx>
-          <w:tblCellMar>
-            <w:top w:w="0" w:type="dxa"/>
-            <w:bottom w:w="0" w:type="dxa"/>
-          </w:tblCellMar>
-        </w:tblPrEx>
         <w:trPr>
           <w:cantSplit/>
         </w:trPr>
@@ -2302,12 +2166,6 @@
         <w:gridCol w:w="9360"/>
       </w:tblGrid>
       <w:tr>
-        <w:tblPrEx>
-          <w:tblCellMar>
-            <w:top w:w="0" w:type="dxa"/>
-            <w:bottom w:w="0" w:type="dxa"/>
-          </w:tblCellMar>
-        </w:tblPrEx>
         <w:trPr>
           <w:cantSplit/>
         </w:trPr>
@@ -2482,12 +2340,6 @@
         <w:gridCol w:w="9360"/>
       </w:tblGrid>
       <w:tr>
-        <w:tblPrEx>
-          <w:tblCellMar>
-            <w:top w:w="0" w:type="dxa"/>
-            <w:bottom w:w="0" w:type="dxa"/>
-          </w:tblCellMar>
-        </w:tblPrEx>
         <w:trPr>
           <w:cantSplit/>
         </w:trPr>
@@ -2630,12 +2482,6 @@
         <w:gridCol w:w="9360"/>
       </w:tblGrid>
       <w:tr>
-        <w:tblPrEx>
-          <w:tblCellMar>
-            <w:top w:w="0" w:type="dxa"/>
-            <w:bottom w:w="0" w:type="dxa"/>
-          </w:tblCellMar>
-        </w:tblPrEx>
         <w:trPr>
           <w:cantSplit/>
         </w:trPr>
@@ -2785,12 +2631,6 @@
         <w:gridCol w:w="9360"/>
       </w:tblGrid>
       <w:tr>
-        <w:tblPrEx>
-          <w:tblCellMar>
-            <w:top w:w="0" w:type="dxa"/>
-            <w:bottom w:w="0" w:type="dxa"/>
-          </w:tblCellMar>
-        </w:tblPrEx>
         <w:trPr>
           <w:cantSplit/>
         </w:trPr>
@@ -2953,12 +2793,6 @@
         <w:gridCol w:w="9360"/>
       </w:tblGrid>
       <w:tr>
-        <w:tblPrEx>
-          <w:tblCellMar>
-            <w:top w:w="0" w:type="dxa"/>
-            <w:bottom w:w="0" w:type="dxa"/>
-          </w:tblCellMar>
-        </w:tblPrEx>
         <w:trPr>
           <w:cantSplit/>
         </w:trPr>
@@ -3009,22 +2843,10 @@
           <w:b/>
           <w:bCs/>
         </w:rPr>
-        <w:t xml:space="preserve"> &amp; </w:t>
-      </w:r>
-      <w:r>
-        <w:rPr>
-          <w:b/>
-          <w:bCs/>
-        </w:rPr>
-        <w:t>required-field validation</w:t>
-      </w:r>
-    </w:p>
-    <w:p>
-      <w:pPr>
-        <w:rPr>
-          <w:rFonts w:hint="eastAsia"/>
-        </w:rPr>
-      </w:pPr>
+        <w:t xml:space="preserve"> &amp; required-field validation</w:t>
+      </w:r>
+    </w:p>
+    <w:p>
       <w:r>
         <w:rPr>
           <w:rFonts w:hint="eastAsia"/>
@@ -3187,12 +3009,6 @@
         <w:gridCol w:w="9360"/>
       </w:tblGrid>
       <w:tr>
-        <w:tblPrEx>
-          <w:tblCellMar>
-            <w:top w:w="0" w:type="dxa"/>
-            <w:bottom w:w="0" w:type="dxa"/>
-          </w:tblCellMar>
-        </w:tblPrEx>
         <w:trPr>
           <w:cantSplit/>
         </w:trPr>
@@ -3317,11 +3133,6 @@
       </w:r>
     </w:p>
     <w:p>
-      <w:pPr>
-        <w:rPr>
-          <w:rFonts w:hint="eastAsia"/>
-        </w:rPr>
-      </w:pPr>
       <w:r>
         <w:br w:type="page"/>
       </w:r>
@@ -3427,12 +3238,6 @@
         <w:gridCol w:w="9360"/>
       </w:tblGrid>
       <w:tr>
-        <w:tblPrEx>
-          <w:tblCellMar>
-            <w:top w:w="0" w:type="dxa"/>
-            <w:bottom w:w="0" w:type="dxa"/>
-          </w:tblCellMar>
-        </w:tblPrEx>
         <w:trPr>
           <w:cantSplit/>
         </w:trPr>
@@ -3953,12 +3758,6 @@
         <w:gridCol w:w="9360"/>
       </w:tblGrid>
       <w:tr>
-        <w:tblPrEx>
-          <w:tblCellMar>
-            <w:top w:w="0" w:type="dxa"/>
-            <w:bottom w:w="0" w:type="dxa"/>
-          </w:tblCellMar>
-        </w:tblPrEx>
         <w:trPr>
           <w:cantSplit/>
         </w:trPr>
@@ -4559,12 +4358,6 @@
         <w:gridCol w:w="9360"/>
       </w:tblGrid>
       <w:tr>
-        <w:tblPrEx>
-          <w:tblCellMar>
-            <w:top w:w="0" w:type="dxa"/>
-            <w:bottom w:w="0" w:type="dxa"/>
-          </w:tblCellMar>
-        </w:tblPrEx>
         <w:trPr>
           <w:cantSplit/>
         </w:trPr>
@@ -5016,12 +4809,6 @@
         <w:gridCol w:w="9360"/>
       </w:tblGrid>
       <w:tr>
-        <w:tblPrEx>
-          <w:tblCellMar>
-            <w:top w:w="0" w:type="dxa"/>
-            <w:bottom w:w="0" w:type="dxa"/>
-          </w:tblCellMar>
-        </w:tblPrEx>
         <w:trPr>
           <w:cantSplit/>
         </w:trPr>
@@ -5356,31 +5143,19 @@
         <w:t xml:space="preserve"> </w:t>
       </w:r>
       <w:r>
-        <w:t>II.</w:t>
-      </w:r>
-      <w:r>
-        <w:t>2,</w:t>
+        <w:t>II.2,</w:t>
       </w:r>
       <w:r>
         <w:t xml:space="preserve"> </w:t>
       </w:r>
       <w:r>
-        <w:t>II.</w:t>
-      </w:r>
-      <w:r>
-        <w:t>3,</w:t>
+        <w:t>II.3,</w:t>
       </w:r>
       <w:r>
         <w:t xml:space="preserve"> </w:t>
       </w:r>
       <w:r>
-        <w:t xml:space="preserve">and </w:t>
-      </w:r>
-      <w:r>
-        <w:t>II.</w:t>
-      </w:r>
-      <w:r>
-        <w:t>4</w:t>
+        <w:t>and II.4</w:t>
       </w:r>
     </w:p>
     <w:p>
@@ -5468,12 +5243,6 @@
         <w:gridCol w:w="9360"/>
       </w:tblGrid>
       <w:tr>
-        <w:tblPrEx>
-          <w:tblCellMar>
-            <w:top w:w="0" w:type="dxa"/>
-            <w:bottom w:w="0" w:type="dxa"/>
-          </w:tblCellMar>
-        </w:tblPrEx>
         <w:trPr>
           <w:cantSplit/>
         </w:trPr>
@@ -6055,12 +5824,6 @@
         <w:gridCol w:w="9360"/>
       </w:tblGrid>
       <w:tr>
-        <w:tblPrEx>
-          <w:tblCellMar>
-            <w:top w:w="0" w:type="dxa"/>
-            <w:bottom w:w="0" w:type="dxa"/>
-          </w:tblCellMar>
-        </w:tblPrEx>
         <w:trPr>
           <w:cantSplit/>
         </w:trPr>
@@ -6212,12 +5975,6 @@
         <w:gridCol w:w="9360"/>
       </w:tblGrid>
       <w:tr>
-        <w:tblPrEx>
-          <w:tblCellMar>
-            <w:top w:w="0" w:type="dxa"/>
-            <w:bottom w:w="0" w:type="dxa"/>
-          </w:tblCellMar>
-        </w:tblPrEx>
         <w:trPr>
           <w:cantSplit/>
         </w:trPr>
@@ -6627,12 +6384,6 @@
         <w:gridCol w:w="9360"/>
       </w:tblGrid>
       <w:tr>
-        <w:tblPrEx>
-          <w:tblCellMar>
-            <w:top w:w="0" w:type="dxa"/>
-            <w:bottom w:w="0" w:type="dxa"/>
-          </w:tblCellMar>
-        </w:tblPrEx>
         <w:trPr>
           <w:cantSplit/>
         </w:trPr>
@@ -6957,12 +6708,6 @@
         <w:gridCol w:w="6760"/>
       </w:tblGrid>
       <w:tr>
-        <w:tblPrEx>
-          <w:tblCellMar>
-            <w:top w:w="0" w:type="dxa"/>
-            <w:bottom w:w="0" w:type="dxa"/>
-          </w:tblCellMar>
-        </w:tblPrEx>
         <w:tc>
           <w:tcPr>
             <w:tcW w:w="2600" w:type="dxa"/>
@@ -7008,12 +6753,6 @@
         </w:tc>
       </w:tr>
       <w:tr>
-        <w:tblPrEx>
-          <w:tblCellMar>
-            <w:top w:w="0" w:type="dxa"/>
-            <w:bottom w:w="0" w:type="dxa"/>
-          </w:tblCellMar>
-        </w:tblPrEx>
         <w:tc>
           <w:tcPr>
             <w:tcW w:w="2600" w:type="dxa"/>
@@ -7059,12 +6798,6 @@
         </w:tc>
       </w:tr>
       <w:tr>
-        <w:tblPrEx>
-          <w:tblCellMar>
-            <w:top w:w="0" w:type="dxa"/>
-            <w:bottom w:w="0" w:type="dxa"/>
-          </w:tblCellMar>
-        </w:tblPrEx>
         <w:tc>
           <w:tcPr>
             <w:tcW w:w="2600" w:type="dxa"/>
@@ -7126,12 +6859,6 @@
         </w:tc>
       </w:tr>
       <w:tr>
-        <w:tblPrEx>
-          <w:tblCellMar>
-            <w:top w:w="0" w:type="dxa"/>
-            <w:bottom w:w="0" w:type="dxa"/>
-          </w:tblCellMar>
-        </w:tblPrEx>
         <w:tc>
           <w:tcPr>
             <w:tcW w:w="2600" w:type="dxa"/>
@@ -7177,12 +6904,6 @@
         </w:tc>
       </w:tr>
       <w:tr>
-        <w:tblPrEx>
-          <w:tblCellMar>
-            <w:top w:w="0" w:type="dxa"/>
-            <w:bottom w:w="0" w:type="dxa"/>
-          </w:tblCellMar>
-        </w:tblPrEx>
         <w:tc>
           <w:tcPr>
             <w:tcW w:w="2600" w:type="dxa"/>
@@ -7244,12 +6965,6 @@
         </w:tc>
       </w:tr>
       <w:tr>
-        <w:tblPrEx>
-          <w:tblCellMar>
-            <w:top w:w="0" w:type="dxa"/>
-            <w:bottom w:w="0" w:type="dxa"/>
-          </w:tblCellMar>
-        </w:tblPrEx>
         <w:tc>
           <w:tcPr>
             <w:tcW w:w="2600" w:type="dxa"/>
@@ -7295,12 +7010,6 @@
         </w:tc>
       </w:tr>
       <w:tr>
-        <w:tblPrEx>
-          <w:tblCellMar>
-            <w:top w:w="0" w:type="dxa"/>
-            <w:bottom w:w="0" w:type="dxa"/>
-          </w:tblCellMar>
-        </w:tblPrEx>
         <w:tc>
           <w:tcPr>
             <w:tcW w:w="2600" w:type="dxa"/>
@@ -7594,12 +7303,6 @@
         <w:gridCol w:w="9360"/>
       </w:tblGrid>
       <w:tr>
-        <w:tblPrEx>
-          <w:tblCellMar>
-            <w:top w:w="0" w:type="dxa"/>
-            <w:bottom w:w="0" w:type="dxa"/>
-          </w:tblCellMar>
-        </w:tblPrEx>
         <w:trPr>
           <w:cantSplit/>
         </w:trPr>
@@ -7680,12 +7383,6 @@
         <w:gridCol w:w="9360"/>
       </w:tblGrid>
       <w:tr>
-        <w:tblPrEx>
-          <w:tblCellMar>
-            <w:top w:w="0" w:type="dxa"/>
-            <w:bottom w:w="0" w:type="dxa"/>
-          </w:tblCellMar>
-        </w:tblPrEx>
         <w:trPr>
           <w:cantSplit/>
         </w:trPr>
@@ -7944,12 +7641,6 @@
         <w:gridCol w:w="9360"/>
       </w:tblGrid>
       <w:tr>
-        <w:tblPrEx>
-          <w:tblCellMar>
-            <w:top w:w="0" w:type="dxa"/>
-            <w:bottom w:w="0" w:type="dxa"/>
-          </w:tblCellMar>
-        </w:tblPrEx>
         <w:trPr>
           <w:cantSplit/>
         </w:trPr>
@@ -8232,12 +7923,6 @@
         <w:gridCol w:w="9360"/>
       </w:tblGrid>
       <w:tr>
-        <w:tblPrEx>
-          <w:tblCellMar>
-            <w:top w:w="0" w:type="dxa"/>
-            <w:bottom w:w="0" w:type="dxa"/>
-          </w:tblCellMar>
-        </w:tblPrEx>
         <w:trPr>
           <w:cantSplit/>
         </w:trPr>
@@ -8698,12 +8383,6 @@
         <w:gridCol w:w="9360"/>
       </w:tblGrid>
       <w:tr>
-        <w:tblPrEx>
-          <w:tblCellMar>
-            <w:top w:w="0" w:type="dxa"/>
-            <w:bottom w:w="0" w:type="dxa"/>
-          </w:tblCellMar>
-        </w:tblPrEx>
         <w:trPr>
           <w:cantSplit/>
         </w:trPr>
@@ -9484,12 +9163,6 @@
         <w:gridCol w:w="9360"/>
       </w:tblGrid>
       <w:tr>
-        <w:tblPrEx>
-          <w:tblCellMar>
-            <w:top w:w="0" w:type="dxa"/>
-            <w:bottom w:w="0" w:type="dxa"/>
-          </w:tblCellMar>
-        </w:tblPrEx>
         <w:trPr>
           <w:cantSplit/>
         </w:trPr>
@@ -9725,12 +9398,6 @@
         <w:gridCol w:w="6960"/>
       </w:tblGrid>
       <w:tr>
-        <w:tblPrEx>
-          <w:tblCellMar>
-            <w:top w:w="0" w:type="dxa"/>
-            <w:bottom w:w="0" w:type="dxa"/>
-          </w:tblCellMar>
-        </w:tblPrEx>
         <w:tc>
           <w:tcPr>
             <w:tcW w:w="2400" w:type="dxa"/>
@@ -9792,12 +9459,6 @@
         </w:tc>
       </w:tr>
       <w:tr>
-        <w:tblPrEx>
-          <w:tblCellMar>
-            <w:top w:w="0" w:type="dxa"/>
-            <w:bottom w:w="0" w:type="dxa"/>
-          </w:tblCellMar>
-        </w:tblPrEx>
         <w:tc>
           <w:tcPr>
             <w:tcW w:w="2400" w:type="dxa"/>
@@ -9843,12 +9504,6 @@
         </w:tc>
       </w:tr>
       <w:tr>
-        <w:tblPrEx>
-          <w:tblCellMar>
-            <w:top w:w="0" w:type="dxa"/>
-            <w:bottom w:w="0" w:type="dxa"/>
-          </w:tblCellMar>
-        </w:tblPrEx>
         <w:tc>
           <w:tcPr>
             <w:tcW w:w="2400" w:type="dxa"/>
@@ -9910,12 +9565,6 @@
         </w:tc>
       </w:tr>
       <w:tr>
-        <w:tblPrEx>
-          <w:tblCellMar>
-            <w:top w:w="0" w:type="dxa"/>
-            <w:bottom w:w="0" w:type="dxa"/>
-          </w:tblCellMar>
-        </w:tblPrEx>
         <w:tc>
           <w:tcPr>
             <w:tcW w:w="2400" w:type="dxa"/>
@@ -9961,12 +9610,6 @@
         </w:tc>
       </w:tr>
       <w:tr>
-        <w:tblPrEx>
-          <w:tblCellMar>
-            <w:top w:w="0" w:type="dxa"/>
-            <w:bottom w:w="0" w:type="dxa"/>
-          </w:tblCellMar>
-        </w:tblPrEx>
         <w:tc>
           <w:tcPr>
             <w:tcW w:w="2400" w:type="dxa"/>
@@ -10012,12 +9655,6 @@
         </w:tc>
       </w:tr>
       <w:tr>
-        <w:tblPrEx>
-          <w:tblCellMar>
-            <w:top w:w="0" w:type="dxa"/>
-            <w:bottom w:w="0" w:type="dxa"/>
-          </w:tblCellMar>
-        </w:tblPrEx>
         <w:tc>
           <w:tcPr>
             <w:tcW w:w="2400" w:type="dxa"/>
@@ -10063,12 +9700,6 @@
         </w:tc>
       </w:tr>
       <w:tr>
-        <w:tblPrEx>
-          <w:tblCellMar>
-            <w:top w:w="0" w:type="dxa"/>
-            <w:bottom w:w="0" w:type="dxa"/>
-          </w:tblCellMar>
-        </w:tblPrEx>
         <w:tc>
           <w:tcPr>
             <w:tcW w:w="2400" w:type="dxa"/>
@@ -10130,12 +9761,6 @@
         </w:tc>
       </w:tr>
       <w:tr>
-        <w:tblPrEx>
-          <w:tblCellMar>
-            <w:top w:w="0" w:type="dxa"/>
-            <w:bottom w:w="0" w:type="dxa"/>
-          </w:tblCellMar>
-        </w:tblPrEx>
         <w:tc>
           <w:tcPr>
             <w:tcW w:w="2400" w:type="dxa"/>
@@ -10215,12 +9840,6 @@
         <w:gridCol w:w="9360"/>
       </w:tblGrid>
       <w:tr>
-        <w:tblPrEx>
-          <w:tblCellMar>
-            <w:top w:w="0" w:type="dxa"/>
-            <w:bottom w:w="0" w:type="dxa"/>
-          </w:tblCellMar>
-        </w:tblPrEx>
         <w:trPr>
           <w:cantSplit/>
         </w:trPr>
@@ -10297,12 +9916,6 @@
         <w:gridCol w:w="2960"/>
       </w:tblGrid>
       <w:tr>
-        <w:tblPrEx>
-          <w:tblCellMar>
-            <w:top w:w="0" w:type="dxa"/>
-            <w:bottom w:w="0" w:type="dxa"/>
-          </w:tblCellMar>
-        </w:tblPrEx>
         <w:tc>
           <w:tcPr>
             <w:tcW w:w="3400" w:type="dxa"/>
@@ -10374,12 +9987,6 @@
         </w:tc>
       </w:tr>
       <w:tr>
-        <w:tblPrEx>
-          <w:tblCellMar>
-            <w:top w:w="0" w:type="dxa"/>
-            <w:bottom w:w="0" w:type="dxa"/>
-          </w:tblCellMar>
-        </w:tblPrEx>
         <w:tc>
           <w:tcPr>
             <w:tcW w:w="3400" w:type="dxa"/>
@@ -10442,12 +10049,6 @@
         </w:tc>
       </w:tr>
       <w:tr>
-        <w:tblPrEx>
-          <w:tblCellMar>
-            <w:top w:w="0" w:type="dxa"/>
-            <w:bottom w:w="0" w:type="dxa"/>
-          </w:tblCellMar>
-        </w:tblPrEx>
         <w:tc>
           <w:tcPr>
             <w:tcW w:w="3400" w:type="dxa"/>
@@ -10510,12 +10111,6 @@
         </w:tc>
       </w:tr>
       <w:tr>
-        <w:tblPrEx>
-          <w:tblCellMar>
-            <w:top w:w="0" w:type="dxa"/>
-            <w:bottom w:w="0" w:type="dxa"/>
-          </w:tblCellMar>
-        </w:tblPrEx>
         <w:tc>
           <w:tcPr>
             <w:tcW w:w="3400" w:type="dxa"/>
@@ -10578,12 +10173,6 @@
         </w:tc>
       </w:tr>
       <w:tr>
-        <w:tblPrEx>
-          <w:tblCellMar>
-            <w:top w:w="0" w:type="dxa"/>
-            <w:bottom w:w="0" w:type="dxa"/>
-          </w:tblCellMar>
-        </w:tblPrEx>
         <w:tc>
           <w:tcPr>
             <w:tcW w:w="3400" w:type="dxa"/>
@@ -10698,12 +10287,6 @@
         <w:gridCol w:w="2960"/>
       </w:tblGrid>
       <w:tr>
-        <w:tblPrEx>
-          <w:tblCellMar>
-            <w:top w:w="0" w:type="dxa"/>
-            <w:bottom w:w="0" w:type="dxa"/>
-          </w:tblCellMar>
-        </w:tblPrEx>
         <w:tc>
           <w:tcPr>
             <w:tcW w:w="3400" w:type="dxa"/>
@@ -10775,12 +10358,6 @@
         </w:tc>
       </w:tr>
       <w:tr>
-        <w:tblPrEx>
-          <w:tblCellMar>
-            <w:top w:w="0" w:type="dxa"/>
-            <w:bottom w:w="0" w:type="dxa"/>
-          </w:tblCellMar>
-        </w:tblPrEx>
         <w:tc>
           <w:tcPr>
             <w:tcW w:w="3400" w:type="dxa"/>
@@ -10843,12 +10420,6 @@
         </w:tc>
       </w:tr>
       <w:tr>
-        <w:tblPrEx>
-          <w:tblCellMar>
-            <w:top w:w="0" w:type="dxa"/>
-            <w:bottom w:w="0" w:type="dxa"/>
-          </w:tblCellMar>
-        </w:tblPrEx>
         <w:tc>
           <w:tcPr>
             <w:tcW w:w="3400" w:type="dxa"/>
@@ -10911,12 +10482,6 @@
         </w:tc>
       </w:tr>
       <w:tr>
-        <w:tblPrEx>
-          <w:tblCellMar>
-            <w:top w:w="0" w:type="dxa"/>
-            <w:bottom w:w="0" w:type="dxa"/>
-          </w:tblCellMar>
-        </w:tblPrEx>
         <w:tc>
           <w:tcPr>
             <w:tcW w:w="3400" w:type="dxa"/>
@@ -11015,12 +10580,6 @@
         <w:gridCol w:w="2960"/>
       </w:tblGrid>
       <w:tr>
-        <w:tblPrEx>
-          <w:tblCellMar>
-            <w:top w:w="0" w:type="dxa"/>
-            <w:bottom w:w="0" w:type="dxa"/>
-          </w:tblCellMar>
-        </w:tblPrEx>
         <w:tc>
           <w:tcPr>
             <w:tcW w:w="3400" w:type="dxa"/>
@@ -11093,12 +10652,6 @@
         </w:tc>
       </w:tr>
       <w:tr>
-        <w:tblPrEx>
-          <w:tblCellMar>
-            <w:top w:w="0" w:type="dxa"/>
-            <w:bottom w:w="0" w:type="dxa"/>
-          </w:tblCellMar>
-        </w:tblPrEx>
         <w:tc>
           <w:tcPr>
             <w:tcW w:w="3400" w:type="dxa"/>
@@ -11161,12 +10714,6 @@
         </w:tc>
       </w:tr>
       <w:tr>
-        <w:tblPrEx>
-          <w:tblCellMar>
-            <w:top w:w="0" w:type="dxa"/>
-            <w:bottom w:w="0" w:type="dxa"/>
-          </w:tblCellMar>
-        </w:tblPrEx>
         <w:tc>
           <w:tcPr>
             <w:tcW w:w="3400" w:type="dxa"/>
@@ -11229,12 +10776,6 @@
         </w:tc>
       </w:tr>
       <w:tr>
-        <w:tblPrEx>
-          <w:tblCellMar>
-            <w:top w:w="0" w:type="dxa"/>
-            <w:bottom w:w="0" w:type="dxa"/>
-          </w:tblCellMar>
-        </w:tblPrEx>
         <w:tc>
           <w:tcPr>
             <w:tcW w:w="3400" w:type="dxa"/>
@@ -11297,12 +10838,6 @@
         </w:tc>
       </w:tr>
       <w:tr>
-        <w:tblPrEx>
-          <w:tblCellMar>
-            <w:top w:w="0" w:type="dxa"/>
-            <w:bottom w:w="0" w:type="dxa"/>
-          </w:tblCellMar>
-        </w:tblPrEx>
         <w:tc>
           <w:tcPr>
             <w:tcW w:w="3400" w:type="dxa"/>
@@ -11772,12 +11307,6 @@
         <w:gridCol w:w="9360"/>
       </w:tblGrid>
       <w:tr>
-        <w:tblPrEx>
-          <w:tblCellMar>
-            <w:top w:w="0" w:type="dxa"/>
-            <w:bottom w:w="0" w:type="dxa"/>
-          </w:tblCellMar>
-        </w:tblPrEx>
         <w:trPr>
           <w:cantSplit/>
         </w:trPr>
@@ -12650,12 +12179,6 @@
         <w:gridCol w:w="9360"/>
       </w:tblGrid>
       <w:tr>
-        <w:tblPrEx>
-          <w:tblCellMar>
-            <w:top w:w="0" w:type="dxa"/>
-            <w:bottom w:w="0" w:type="dxa"/>
-          </w:tblCellMar>
-        </w:tblPrEx>
         <w:trPr>
           <w:cantSplit/>
         </w:trPr>
@@ -12836,12 +12359,6 @@
         <w:gridCol w:w="9360"/>
       </w:tblGrid>
       <w:tr>
-        <w:tblPrEx>
-          <w:tblCellMar>
-            <w:top w:w="0" w:type="dxa"/>
-            <w:bottom w:w="0" w:type="dxa"/>
-          </w:tblCellMar>
-        </w:tblPrEx>
         <w:trPr>
           <w:cantSplit/>
         </w:trPr>
@@ -13288,12 +12805,6 @@
         <w:gridCol w:w="9360"/>
       </w:tblGrid>
       <w:tr>
-        <w:tblPrEx>
-          <w:tblCellMar>
-            <w:top w:w="0" w:type="dxa"/>
-            <w:bottom w:w="0" w:type="dxa"/>
-          </w:tblCellMar>
-        </w:tblPrEx>
         <w:trPr>
           <w:cantSplit/>
         </w:trPr>
@@ -13502,12 +13013,6 @@
         <w:gridCol w:w="9360"/>
       </w:tblGrid>
       <w:tr>
-        <w:tblPrEx>
-          <w:tblCellMar>
-            <w:top w:w="0" w:type="dxa"/>
-            <w:bottom w:w="0" w:type="dxa"/>
-          </w:tblCellMar>
-        </w:tblPrEx>
         <w:trPr>
           <w:cantSplit/>
         </w:trPr>
@@ -13608,12 +13113,6 @@
         <w:gridCol w:w="1700"/>
       </w:tblGrid>
       <w:tr>
-        <w:tblPrEx>
-          <w:tblCellMar>
-            <w:top w:w="0" w:type="dxa"/>
-            <w:bottom w:w="0" w:type="dxa"/>
-          </w:tblCellMar>
-        </w:tblPrEx>
         <w:tc>
           <w:tcPr>
             <w:tcW w:w="900" w:type="dxa"/>
@@ -13774,12 +13273,6 @@
         </w:tc>
       </w:tr>
       <w:tr>
-        <w:tblPrEx>
-          <w:tblCellMar>
-            <w:top w:w="0" w:type="dxa"/>
-            <w:bottom w:w="0" w:type="dxa"/>
-          </w:tblCellMar>
-        </w:tblPrEx>
         <w:tc>
           <w:tcPr>
             <w:tcW w:w="900" w:type="dxa"/>
@@ -13902,12 +13395,6 @@
         </w:tc>
       </w:tr>
       <w:tr>
-        <w:tblPrEx>
-          <w:tblCellMar>
-            <w:top w:w="0" w:type="dxa"/>
-            <w:bottom w:w="0" w:type="dxa"/>
-          </w:tblCellMar>
-        </w:tblPrEx>
         <w:tc>
           <w:tcPr>
             <w:tcW w:w="900" w:type="dxa"/>
@@ -14030,12 +13517,6 @@
         </w:tc>
       </w:tr>
       <w:tr>
-        <w:tblPrEx>
-          <w:tblCellMar>
-            <w:top w:w="0" w:type="dxa"/>
-            <w:bottom w:w="0" w:type="dxa"/>
-          </w:tblCellMar>
-        </w:tblPrEx>
         <w:tc>
           <w:tcPr>
             <w:tcW w:w="900" w:type="dxa"/>
@@ -14158,12 +13639,6 @@
         </w:tc>
       </w:tr>
       <w:tr>
-        <w:tblPrEx>
-          <w:tblCellMar>
-            <w:top w:w="0" w:type="dxa"/>
-            <w:bottom w:w="0" w:type="dxa"/>
-          </w:tblCellMar>
-        </w:tblPrEx>
         <w:tc>
           <w:tcPr>
             <w:tcW w:w="900" w:type="dxa"/>
@@ -14286,12 +13761,6 @@
         </w:tc>
       </w:tr>
       <w:tr>
-        <w:tblPrEx>
-          <w:tblCellMar>
-            <w:top w:w="0" w:type="dxa"/>
-            <w:bottom w:w="0" w:type="dxa"/>
-          </w:tblCellMar>
-        </w:tblPrEx>
         <w:tc>
           <w:tcPr>
             <w:tcW w:w="900" w:type="dxa"/>
@@ -14414,12 +13883,6 @@
         </w:tc>
       </w:tr>
       <w:tr>
-        <w:tblPrEx>
-          <w:tblCellMar>
-            <w:top w:w="0" w:type="dxa"/>
-            <w:bottom w:w="0" w:type="dxa"/>
-          </w:tblCellMar>
-        </w:tblPrEx>
         <w:tc>
           <w:tcPr>
             <w:tcW w:w="900" w:type="dxa"/>
@@ -14576,12 +14039,6 @@
         <w:gridCol w:w="9360"/>
       </w:tblGrid>
       <w:tr>
-        <w:tblPrEx>
-          <w:tblCellMar>
-            <w:top w:w="0" w:type="dxa"/>
-            <w:bottom w:w="0" w:type="dxa"/>
-          </w:tblCellMar>
-        </w:tblPrEx>
         <w:trPr>
           <w:cantSplit/>
         </w:trPr>
@@ -14808,12 +14265,6 @@
         </w:tc>
       </w:tr>
       <w:tr>
-        <w:tblPrEx>
-          <w:tblCellMar>
-            <w:top w:w="0" w:type="dxa"/>
-            <w:bottom w:w="0" w:type="dxa"/>
-          </w:tblCellMar>
-        </w:tblPrEx>
         <w:trPr>
           <w:cantSplit/>
         </w:trPr>
@@ -14885,13 +14336,7 @@
           <w:p/>
           <w:p/>
           <w:p/>
-          <w:p>
-            <w:pPr>
-              <w:rPr>
-                <w:rFonts w:hint="eastAsia"/>
-              </w:rPr>
-            </w:pPr>
-          </w:p>
+          <w:p/>
         </w:tc>
       </w:tr>
     </w:tbl>
@@ -14930,12 +14375,6 @@
         <w:gridCol w:w="9680"/>
       </w:tblGrid>
       <w:tr>
-        <w:tblPrEx>
-          <w:tblCellMar>
-            <w:top w:w="0" w:type="dxa"/>
-            <w:bottom w:w="0" w:type="dxa"/>
-          </w:tblCellMar>
-        </w:tblPrEx>
         <w:trPr>
           <w:cantSplit/>
         </w:trPr>
@@ -15155,12 +14594,6 @@
         </w:tc>
       </w:tr>
       <w:tr>
-        <w:tblPrEx>
-          <w:tblCellMar>
-            <w:top w:w="0" w:type="dxa"/>
-            <w:bottom w:w="0" w:type="dxa"/>
-          </w:tblCellMar>
-        </w:tblPrEx>
         <w:trPr>
           <w:cantSplit/>
         </w:trPr>
@@ -15389,12 +14822,6 @@
         <w:gridCol w:w="9360"/>
       </w:tblGrid>
       <w:tr>
-        <w:tblPrEx>
-          <w:tblCellMar>
-            <w:top w:w="0" w:type="dxa"/>
-            <w:bottom w:w="0" w:type="dxa"/>
-          </w:tblCellMar>
-        </w:tblPrEx>
         <w:trPr>
           <w:cantSplit/>
         </w:trPr>
@@ -15506,12 +14933,6 @@
         <w:gridCol w:w="9360"/>
       </w:tblGrid>
       <w:tr>
-        <w:tblPrEx>
-          <w:tblCellMar>
-            <w:top w:w="0" w:type="dxa"/>
-            <w:bottom w:w="0" w:type="dxa"/>
-          </w:tblCellMar>
-        </w:tblPrEx>
         <w:trPr>
           <w:cantSplit/>
         </w:trPr>
@@ -15798,8 +15219,6 @@
       <w:r>
         <w:t xml:space="preserve"> old turns, retrieving only the relevant history instead of all of it, and caching the unchanged prefix so the same prefill is not paid for twice.</w:t>
       </w:r>
-      <w:bookmarkStart w:id="0" w:name="_GoBack"/>
-      <w:bookmarkEnd w:id="0"/>
     </w:p>
     <w:sectPr>
       <w:headerReference w:type="even" r:id="rId21"/>
@@ -16671,7 +16090,6 @@
     <w:name w:val="Normal (Web)"/>
     <w:basedOn w:val="Normal"/>
     <w:uiPriority w:val="99"/>
-    <w:semiHidden/>
     <w:unhideWhenUsed/>
     <w:rsid w:val="008F49F5"/>
     <w:pPr>

</xml_diff>